<commit_message>
chore: remove Word temp file
</commit_message>
<xml_diff>
--- a/docs/Week9_RL基础_MDP_Bellman_策略迭代_值迭代.docx
+++ b/docs/Week9_RL基础_MDP_Bellman_策略迭代_值迭代.docx
@@ -2203,6 +2203,7 @@
       <w:pPr>
         <w:rPr>
           <w:rFonts w:hint="eastAsia"/>
+          <w:lang w:eastAsia="zh-CN"/>
         </w:rPr>
       </w:pPr>
       <w:r>
@@ -2211,21 +2212,46 @@
       </w:r>
       <w:r>
         <w:br/>
-        <w:t xml:space="preserve">  选 a* = argmax_a Q(s,a)</w:t>
+        <w:t xml:space="preserve">  选 a* = argmax_a Q(</w:t>
+      </w:r>
+      <w:proofErr w:type="gramStart"/>
+      <w:r>
+        <w:t>s,a</w:t>
+      </w:r>
+      <w:proofErr w:type="gramEnd"/>
+      <w:r>
+        <w:t>)</w:t>
+      </w:r>
+      <w:r>
+        <w:rPr>
+          <w:rFonts w:hint="eastAsia"/>
+          <w:lang w:eastAsia="zh-CN"/>
+        </w:rPr>
+        <w:t xml:space="preserve">  </w:t>
       </w:r>
     </w:p>
     <w:p>
       <w:pPr>
         <w:pStyle w:val="1"/>
       </w:pPr>
+      <w:proofErr w:type="spellStart"/>
       <w:r>
         <w:t>第四章：</w:t>
       </w:r>
       <w:r>
-        <w:t xml:space="preserve">Bellman </w:t>
-      </w:r>
-      <w:r>
-        <w:t>方程（核心）</w:t>
+        <w:t>Bellman</w:t>
+      </w:r>
+      <w:proofErr w:type="spellEnd"/>
+      <w:r>
+        <w:t xml:space="preserve"> </w:t>
+      </w:r>
+      <w:proofErr w:type="spellStart"/>
+      <w:r>
+        <w:t>方程（核心</w:t>
+      </w:r>
+      <w:proofErr w:type="spellEnd"/>
+      <w:r>
+        <w:t>）</w:t>
       </w:r>
     </w:p>
     <w:p>
@@ -2246,7 +2272,15 @@
         </w:rPr>
       </w:pPr>
       <w:r>
-        <w:t>Bellman 方程是强化学习的"牛顿定律"——它揭示了 V(s) 和 Q(s,a) 的自洽关系。</w:t>
+        <w:t>Bellman 方程是强化学习的"牛顿定律"——它揭示了 V(s) 和 Q(</w:t>
+      </w:r>
+      <w:proofErr w:type="gramStart"/>
+      <w:r>
+        <w:t>s,a</w:t>
+      </w:r>
+      <w:proofErr w:type="gramEnd"/>
+      <w:r>
+        <w:t>) 的自洽关系。</w:t>
       </w:r>
       <w:r>
         <w:br/>
@@ -2264,6 +2298,13 @@
       </w:r>
       <w:r>
         <w:br/>
+      </w:r>
+      <w:r>
+        <w:rPr>
+          <w:rFonts w:hint="eastAsia"/>
+          <w:lang w:eastAsia="zh-CN"/>
+        </w:rPr>
+        <w:t xml:space="preserve">  </w:t>
       </w:r>
       <w:r>
         <w:br/>

</xml_diff>